<commit_message>
feat: web app, Chrome extension, live webcam and role-based screens
- Next.js web app (ems/web): screens from the designer bundle against the
  real API; role-based navigation, pages and dashboards per spec 7.2
- MV3 Chrome extension (ems/extension): sign-in, consent, check-in/out,
  breaks, heartbeat, screen and opt-in webcam sharing, settings
- Opt-in live webcam (db/006, migration 0005): separate consent, only
  while checked in, paused on breaks, no recording or audio
- CEO/COO video wall: POST /room/stream/view-grid, one logged and
  notified view per live employee
- Extension attaches to a web check-in with a fresh token
- Read-only lists for the screens: deals, clients, invoices, hunts,
  break requests, org settings with version
- Tests: test_webcam.py, test_web_lists.py; CI jobs for web and extension
- Docs: code and maintenance notes, READMEs
</commit_message>
<xml_diff>
--- a/docs/EMS_Code_Notes.docx
+++ b/docs/EMS_Code_Notes.docx
@@ -6176,6 +6176,64 @@
     </w:p>
     <w:p>
       <w:pPr>
+        <w:pStyle w:val="ListParagraph"/>
+        <w:numPr>
+          <w:ilvl w:val="0"/>
+          <w:numId w:val="2"/>
+        </w:numPr>
+        <w:spacing w:after="60"/>
+      </w:pPr>
+      <w:r>
+        <w:rPr>
+          <w:rFonts w:ascii="Consolas" w:cs="Consolas" w:eastAsia="Consolas" w:hAnsi="Consolas"/>
+          <w:color w:val="7B2C2C"/>
+          <w:sz w:val="19"/>
+          <w:szCs w:val="19"/>
+        </w:rPr>
+        <w:t xml:space="preserve">db/006</w:t>
+      </w:r>
+      <w:r>
+        <w:t xml:space="preserve"> (Alembic </w:t>
+      </w:r>
+      <w:r>
+        <w:rPr>
+          <w:rFonts w:ascii="Consolas" w:cs="Consolas" w:eastAsia="Consolas" w:hAnsi="Consolas"/>
+          <w:color w:val="7B2C2C"/>
+          <w:sz w:val="19"/>
+          <w:szCs w:val="19"/>
+        </w:rPr>
+        <w:t xml:space="preserve">0005</w:t>
+      </w:r>
+      <w:r>
+        <w:t xml:space="preserve">): </w:t>
+      </w:r>
+      <w:r>
+        <w:rPr>
+          <w:rFonts w:ascii="Consolas" w:cs="Consolas" w:eastAsia="Consolas" w:hAnsi="Consolas"/>
+          <w:color w:val="7B2C2C"/>
+          <w:sz w:val="19"/>
+          <w:szCs w:val="19"/>
+        </w:rPr>
+        <w:t xml:space="preserve">stream_consents.webcam</w:t>
+      </w:r>
+      <w:r>
+        <w:t xml:space="preserve"> and </w:t>
+      </w:r>
+      <w:r>
+        <w:rPr>
+          <w:rFonts w:ascii="Consolas" w:cs="Consolas" w:eastAsia="Consolas" w:hAnsi="Consolas"/>
+          <w:color w:val="7B2C2C"/>
+          <w:sz w:val="19"/>
+          <w:szCs w:val="19"/>
+        </w:rPr>
+        <w:t xml:space="preserve">work_sessions.camera</w:t>
+      </w:r>
+      <w:r>
+        <w:t xml:space="preserve"> for the opt-in live webcam.</w:t>
+      </w:r>
+    </w:p>
+    <w:p>
+      <w:pPr>
         <w:pStyle w:val="Heading1"/>
       </w:pPr>
       <w:r>
@@ -6784,7 +6842,237 @@
         <w:spacing w:after="60"/>
       </w:pPr>
       <w:r>
-        <w:t xml:space="preserve">Repeat check-in returns the open session without a new extension token (open product question).</w:t>
+        <w:rPr>
+          <w:b/>
+          <w:bCs/>
+        </w:rPr>
+        <w:t xml:space="preserve">Webcam (product decision, deviates from spec Section 9.1)</w:t>
+      </w:r>
+      <w:r>
+        <w:t xml:space="preserve">: </w:t>
+      </w:r>
+      <w:r>
+        <w:rPr>
+          <w:rFonts w:ascii="Consolas" w:cs="Consolas" w:eastAsia="Consolas" w:hAnsi="Consolas"/>
+          <w:color w:val="7B2C2C"/>
+          <w:sz w:val="19"/>
+          <w:szCs w:val="19"/>
+        </w:rPr>
+        <w:t xml:space="preserve">db/006</w:t>
+      </w:r>
+      <w:r>
+        <w:t xml:space="preserve"> adds </w:t>
+      </w:r>
+      <w:r>
+        <w:rPr>
+          <w:rFonts w:ascii="Consolas" w:cs="Consolas" w:eastAsia="Consolas" w:hAnsi="Consolas"/>
+          <w:color w:val="7B2C2C"/>
+          <w:sz w:val="19"/>
+          <w:szCs w:val="19"/>
+        </w:rPr>
+        <w:t xml:space="preserve">stream_consents.webcam</w:t>
+      </w:r>
+      <w:r>
+        <w:t xml:space="preserve"> and </w:t>
+      </w:r>
+      <w:r>
+        <w:rPr>
+          <w:rFonts w:ascii="Consolas" w:cs="Consolas" w:eastAsia="Consolas" w:hAnsi="Consolas"/>
+          <w:color w:val="7B2C2C"/>
+          <w:sz w:val="19"/>
+          <w:szCs w:val="19"/>
+        </w:rPr>
+        <w:t xml:space="preserve">work_sessions.camera</w:t>
+      </w:r>
+      <w:r>
+        <w:t xml:space="preserve">. The webcam is a separate opt-in on the consent (API-017 </w:t>
+      </w:r>
+      <w:r>
+        <w:rPr>
+          <w:rFonts w:ascii="Consolas" w:cs="Consolas" w:eastAsia="Consolas" w:hAnsi="Consolas"/>
+          <w:color w:val="7B2C2C"/>
+          <w:sz w:val="19"/>
+          <w:szCs w:val="19"/>
+        </w:rPr>
+        <w:t xml:space="preserve">webcam</w:t>
+      </w:r>
+      <w:r>
+        <w:t xml:space="preserve">), live only while checked in, never recorded, no audio, paused on breaks, and only while </w:t>
+      </w:r>
+      <w:r>
+        <w:rPr>
+          <w:rFonts w:ascii="Consolas" w:cs="Consolas" w:eastAsia="Consolas" w:hAnsi="Consolas"/>
+          <w:color w:val="7B2C2C"/>
+          <w:sz w:val="19"/>
+          <w:szCs w:val="19"/>
+        </w:rPr>
+        <w:t xml:space="preserve">live_view_enabled</w:t>
+      </w:r>
+      <w:r>
+        <w:t xml:space="preserve"> (</w:t>
+      </w:r>
+      <w:r>
+        <w:rPr>
+          <w:rFonts w:ascii="Consolas" w:cs="Consolas" w:eastAsia="Consolas" w:hAnsi="Consolas"/>
+          <w:color w:val="7B2C2C"/>
+          <w:sz w:val="19"/>
+          <w:szCs w:val="19"/>
+        </w:rPr>
+        <w:t xml:space="preserve">service.camera_allowed</w:t>
+      </w:r>
+      <w:r>
+        <w:t xml:space="preserve">). Heartbeats report </w:t>
+      </w:r>
+      <w:r>
+        <w:rPr>
+          <w:rFonts w:ascii="Consolas" w:cs="Consolas" w:eastAsia="Consolas" w:hAnsi="Consolas"/>
+          <w:color w:val="7B2C2C"/>
+          <w:sz w:val="19"/>
+          <w:szCs w:val="19"/>
+        </w:rPr>
+        <w:t xml:space="preserve">camera</w:t>
+      </w:r>
+      <w:r>
+        <w:t xml:space="preserve"> (API-019); the publish token (API-024 </w:t>
+      </w:r>
+      <w:r>
+        <w:rPr>
+          <w:rFonts w:ascii="Consolas" w:cs="Consolas" w:eastAsia="Consolas" w:hAnsi="Consolas"/>
+          <w:color w:val="7B2C2C"/>
+          <w:sz w:val="19"/>
+          <w:szCs w:val="19"/>
+        </w:rPr>
+        <w:t xml:space="preserve">camera</w:t>
+      </w:r>
+      <w:r>
+        <w:t xml:space="preserve">) adds the </w:t>
+      </w:r>
+      <w:r>
+        <w:rPr>
+          <w:rFonts w:ascii="Consolas" w:cs="Consolas" w:eastAsia="Consolas" w:hAnsi="Consolas"/>
+          <w:color w:val="7B2C2C"/>
+          <w:sz w:val="19"/>
+          <w:szCs w:val="19"/>
+        </w:rPr>
+        <w:t xml:space="preserve">camera</w:t>
+      </w:r>
+      <w:r>
+        <w:t xml:space="preserve"> source only with webcam consent. A view stays open while the employee shares the screen </w:t>
+      </w:r>
+      <w:r>
+        <w:rPr>
+          <w:b/>
+          <w:bCs/>
+        </w:rPr>
+        <w:t xml:space="preserve">or</w:t>
+      </w:r>
+      <w:r>
+        <w:t xml:space="preserve"> the webcam (</w:t>
+      </w:r>
+      <w:r>
+        <w:rPr>
+          <w:rFonts w:ascii="Consolas" w:cs="Consolas" w:eastAsia="Consolas" w:hAnsi="Consolas"/>
+          <w:color w:val="7B2C2C"/>
+          <w:sz w:val="19"/>
+          <w:szCs w:val="19"/>
+        </w:rPr>
+        <w:t xml:space="preserve">views_to_disconnect</w:t>
+      </w:r>
+      <w:r>
+        <w:t xml:space="preserve">).</w:t>
+      </w:r>
+    </w:p>
+    <w:p>
+      <w:pPr>
+        <w:pStyle w:val="ListParagraph"/>
+        <w:numPr>
+          <w:ilvl w:val="0"/>
+          <w:numId w:val="2"/>
+        </w:numPr>
+        <w:spacing w:after="60"/>
+      </w:pPr>
+      <w:r>
+        <w:rPr>
+          <w:b/>
+          <w:bCs/>
+        </w:rPr>
+        <w:t xml:space="preserve">CEO video wall</w:t>
+      </w:r>
+      <w:r>
+        <w:t xml:space="preserve">: </w:t>
+      </w:r>
+      <w:r>
+        <w:rPr>
+          <w:rFonts w:ascii="Consolas" w:cs="Consolas" w:eastAsia="Consolas" w:hAnsi="Consolas"/>
+          <w:color w:val="7B2C2C"/>
+          <w:sz w:val="19"/>
+          <w:szCs w:val="19"/>
+        </w:rPr>
+        <w:t xml:space="preserve">POST /room/stream/view-grid</w:t>
+      </w:r>
+      <w:r>
+        <w:t xml:space="preserve"> (not in the contract; </w:t>
+      </w:r>
+      <w:r>
+        <w:rPr>
+          <w:rFonts w:ascii="Consolas" w:cs="Consolas" w:eastAsia="Consolas" w:hAnsi="Consolas"/>
+          <w:color w:val="7B2C2C"/>
+          <w:sz w:val="19"/>
+          <w:szCs w:val="19"/>
+        </w:rPr>
+        <w:t xml:space="preserve">room.view_live</w:t>
+      </w:r>
+      <w:r>
+        <w:t xml:space="preserve">, reason required, up to 48 people) opens one logged view per live employee through the same </w:t>
+      </w:r>
+      <w:r>
+        <w:rPr>
+          <w:rFonts w:ascii="Consolas" w:cs="Consolas" w:eastAsia="Consolas" w:hAnsi="Consolas"/>
+          <w:color w:val="7B2C2C"/>
+          <w:sz w:val="19"/>
+          <w:szCs w:val="19"/>
+        </w:rPr>
+        <w:t xml:space="preserve">_start_view</w:t>
+      </w:r>
+      <w:r>
+        <w:t xml:space="preserve"> path as API-026, so each employee is notified and each view is audited and ended individually (API-027).</w:t>
+      </w:r>
+    </w:p>
+    <w:p>
+      <w:pPr>
+        <w:pStyle w:val="ListParagraph"/>
+        <w:numPr>
+          <w:ilvl w:val="0"/>
+          <w:numId w:val="2"/>
+        </w:numPr>
+        <w:spacing w:after="60"/>
+      </w:pPr>
+      <w:r>
+        <w:t xml:space="preserve">Repeat check-in from the extension (</w:t>
+      </w:r>
+      <w:r>
+        <w:rPr>
+          <w:rFonts w:ascii="Consolas" w:cs="Consolas" w:eastAsia="Consolas" w:hAnsi="Consolas"/>
+          <w:color w:val="7B2C2C"/>
+          <w:sz w:val="19"/>
+          <w:szCs w:val="19"/>
+        </w:rPr>
+        <w:t xml:space="preserve">device.kind = chrome_extension</w:t>
+      </w:r>
+      <w:r>
+        <w:t xml:space="preserve">, session auth) after a web check-in revokes old extension tokens and returns a fresh one (audit </w:t>
+      </w:r>
+      <w:r>
+        <w:rPr>
+          <w:rFonts w:ascii="Consolas" w:cs="Consolas" w:eastAsia="Consolas" w:hAnsi="Consolas"/>
+          <w:color w:val="7B2C2C"/>
+          <w:sz w:val="19"/>
+          <w:szCs w:val="19"/>
+        </w:rPr>
+        <w:t xml:space="preserve">room.extension_attached</w:t>
+      </w:r>
+      <w:r>
+        <w:t xml:space="preserve">); other repeats return the open session.</w:t>
       </w:r>
     </w:p>
     <w:p>
@@ -10093,7 +10381,7 @@
                 <w:sz w:val="18"/>
                 <w:szCs w:val="18"/>
               </w:rPr>
-              <w:t xml:space="preserve">Worker LiveKit config</w:t>
+              <w:t xml:space="preserve">Webcam</w:t>
             </w:r>
           </w:p>
         </w:tc>
@@ -10122,8 +10410,61 @@
                 <w:sz w:val="18"/>
                 <w:szCs w:val="18"/>
               </w:rPr>
-              <w:t xml:space="preserve">The worker reads </w:t>
-            </w:r>
+              <w:t xml:space="preserve">Opt-in live webcam (see Room); a product-owner decision that deviates from spec 9.1. OD-02 legal review must cover it.</w:t>
+            </w:r>
+          </w:p>
+        </w:tc>
+      </w:tr>
+      <w:tr>
+        <w:tc>
+          <w:tcPr>
+            <w:tcW w:type="dxa" w:w="2232"/>
+            <w:tcBorders>
+              <w:top w:val="single" w:color="BFBFBF" w:sz="4"/>
+              <w:left w:val="single" w:color="BFBFBF" w:sz="4"/>
+              <w:bottom w:val="single" w:color="BFBFBF" w:sz="4"/>
+              <w:right w:val="single" w:color="BFBFBF" w:sz="4"/>
+            </w:tcBorders>
+            <w:tcMar>
+              <w:top w:type="dxa" w:w="60"/>
+              <w:left w:type="dxa" w:w="100"/>
+              <w:bottom w:type="dxa" w:w="60"/>
+              <w:right w:type="dxa" w:w="100"/>
+            </w:tcMar>
+          </w:tcPr>
+          <w:p>
+            <w:pPr>
+              <w:spacing w:before="0" w:after="0"/>
+            </w:pPr>
+            <w:r>
+              <w:rPr>
+                <w:sz w:val="18"/>
+                <w:szCs w:val="18"/>
+              </w:rPr>
+              <w:t xml:space="preserve">Video wall</w:t>
+            </w:r>
+          </w:p>
+        </w:tc>
+        <w:tc>
+          <w:tcPr>
+            <w:tcW w:type="dxa" w:w="6794"/>
+            <w:tcBorders>
+              <w:top w:val="single" w:color="BFBFBF" w:sz="4"/>
+              <w:left w:val="single" w:color="BFBFBF" w:sz="4"/>
+              <w:bottom w:val="single" w:color="BFBFBF" w:sz="4"/>
+              <w:right w:val="single" w:color="BFBFBF" w:sz="4"/>
+            </w:tcBorders>
+            <w:tcMar>
+              <w:top w:type="dxa" w:w="60"/>
+              <w:left w:type="dxa" w:w="100"/>
+              <w:bottom w:type="dxa" w:w="60"/>
+              <w:right w:type="dxa" w:w="100"/>
+            </w:tcMar>
+          </w:tcPr>
+          <w:p>
+            <w:pPr>
+              <w:spacing w:before="0" w:after="0"/>
+            </w:pPr>
             <w:r>
               <w:rPr>
                 <w:rFonts w:ascii="Consolas" w:cs="Consolas" w:eastAsia="Consolas" w:hAnsi="Consolas"/>
@@ -10131,6 +10472,142 @@
                 <w:sz w:val="16"/>
                 <w:szCs w:val="16"/>
               </w:rPr>
+              <w:t xml:space="preserve">POST /room/stream/view-grid</w:t>
+            </w:r>
+            <w:r>
+              <w:rPr>
+                <w:sz w:val="18"/>
+                <w:szCs w:val="18"/>
+              </w:rPr>
+              <w:t xml:space="preserve"> opens one logged, notified view per live employee.</w:t>
+            </w:r>
+          </w:p>
+        </w:tc>
+      </w:tr>
+      <w:tr>
+        <w:tc>
+          <w:tcPr>
+            <w:tcW w:type="dxa" w:w="2232"/>
+            <w:tcBorders>
+              <w:top w:val="single" w:color="BFBFBF" w:sz="4"/>
+              <w:left w:val="single" w:color="BFBFBF" w:sz="4"/>
+              <w:bottom w:val="single" w:color="BFBFBF" w:sz="4"/>
+              <w:right w:val="single" w:color="BFBFBF" w:sz="4"/>
+            </w:tcBorders>
+            <w:tcMar>
+              <w:top w:type="dxa" w:w="60"/>
+              <w:left w:type="dxa" w:w="100"/>
+              <w:bottom w:type="dxa" w:w="60"/>
+              <w:right w:type="dxa" w:w="100"/>
+            </w:tcMar>
+          </w:tcPr>
+          <w:p>
+            <w:pPr>
+              <w:spacing w:before="0" w:after="0"/>
+            </w:pPr>
+            <w:r>
+              <w:rPr>
+                <w:sz w:val="18"/>
+                <w:szCs w:val="18"/>
+              </w:rPr>
+              <w:t xml:space="preserve">Web check-in</w:t>
+            </w:r>
+          </w:p>
+        </w:tc>
+        <w:tc>
+          <w:tcPr>
+            <w:tcW w:type="dxa" w:w="6794"/>
+            <w:tcBorders>
+              <w:top w:val="single" w:color="BFBFBF" w:sz="4"/>
+              <w:left w:val="single" w:color="BFBFBF" w:sz="4"/>
+              <w:bottom w:val="single" w:color="BFBFBF" w:sz="4"/>
+              <w:right w:val="single" w:color="BFBFBF" w:sz="4"/>
+            </w:tcBorders>
+            <w:tcMar>
+              <w:top w:type="dxa" w:w="60"/>
+              <w:left w:type="dxa" w:w="100"/>
+              <w:bottom w:type="dxa" w:w="60"/>
+              <w:right w:type="dxa" w:w="100"/>
+            </w:tcMar>
+          </w:tcPr>
+          <w:p>
+            <w:pPr>
+              <w:spacing w:before="0" w:after="0"/>
+            </w:pPr>
+            <w:r>
+              <w:rPr>
+                <w:sz w:val="18"/>
+                <w:szCs w:val="18"/>
+              </w:rPr>
+              <w:t xml:space="preserve">Extension repeat check-in gets a fresh token, so the extension can attach to a web check-in.</w:t>
+            </w:r>
+          </w:p>
+        </w:tc>
+      </w:tr>
+      <w:tr>
+        <w:tc>
+          <w:tcPr>
+            <w:tcW w:type="dxa" w:w="2232"/>
+            <w:tcBorders>
+              <w:top w:val="single" w:color="BFBFBF" w:sz="4"/>
+              <w:left w:val="single" w:color="BFBFBF" w:sz="4"/>
+              <w:bottom w:val="single" w:color="BFBFBF" w:sz="4"/>
+              <w:right w:val="single" w:color="BFBFBF" w:sz="4"/>
+            </w:tcBorders>
+            <w:tcMar>
+              <w:top w:type="dxa" w:w="60"/>
+              <w:left w:type="dxa" w:w="100"/>
+              <w:bottom w:type="dxa" w:w="60"/>
+              <w:right w:type="dxa" w:w="100"/>
+            </w:tcMar>
+          </w:tcPr>
+          <w:p>
+            <w:pPr>
+              <w:spacing w:before="0" w:after="0"/>
+            </w:pPr>
+            <w:r>
+              <w:rPr>
+                <w:sz w:val="18"/>
+                <w:szCs w:val="18"/>
+              </w:rPr>
+              <w:t xml:space="preserve">Worker LiveKit config</w:t>
+            </w:r>
+          </w:p>
+        </w:tc>
+        <w:tc>
+          <w:tcPr>
+            <w:tcW w:type="dxa" w:w="6794"/>
+            <w:tcBorders>
+              <w:top w:val="single" w:color="BFBFBF" w:sz="4"/>
+              <w:left w:val="single" w:color="BFBFBF" w:sz="4"/>
+              <w:bottom w:val="single" w:color="BFBFBF" w:sz="4"/>
+              <w:right w:val="single" w:color="BFBFBF" w:sz="4"/>
+            </w:tcBorders>
+            <w:tcMar>
+              <w:top w:type="dxa" w:w="60"/>
+              <w:left w:type="dxa" w:w="100"/>
+              <w:bottom w:type="dxa" w:w="60"/>
+              <w:right w:type="dxa" w:w="100"/>
+            </w:tcMar>
+          </w:tcPr>
+          <w:p>
+            <w:pPr>
+              <w:spacing w:before="0" w:after="0"/>
+            </w:pPr>
+            <w:r>
+              <w:rPr>
+                <w:sz w:val="18"/>
+                <w:szCs w:val="18"/>
+              </w:rPr>
+              <w:t xml:space="preserve">The worker reads </w:t>
+            </w:r>
+            <w:r>
+              <w:rPr>
+                <w:rFonts w:ascii="Consolas" w:cs="Consolas" w:eastAsia="Consolas" w:hAnsi="Consolas"/>
+                <w:color w:val="7B2C2C"/>
+                <w:sz w:val="16"/>
+                <w:szCs w:val="16"/>
+              </w:rPr>
               <w:t xml:space="preserve">LIVEKIT_URL/_API_KEY/_API_SECRET</w:t>
             </w:r>
             <w:r>
@@ -10154,7 +10631,399 @@
         <w:pStyle w:val="Heading1"/>
       </w:pPr>
       <w:r>
-        <w:t xml:space="preserve">8. Out of scope for this backend</w:t>
+        <w:t xml:space="preserve">8. Web app and Chrome extension</w:t>
+      </w:r>
+    </w:p>
+    <w:p>
+      <w:pPr>
+        <w:pStyle w:val="ListParagraph"/>
+        <w:numPr>
+          <w:ilvl w:val="0"/>
+          <w:numId w:val="2"/>
+        </w:numPr>
+        <w:spacing w:after="60"/>
+      </w:pPr>
+      <w:r>
+        <w:rPr>
+          <w:b/>
+          <w:bCs/>
+        </w:rPr>
+        <w:t xml:space="preserve">Web</w:t>
+      </w:r>
+      <w:r>
+        <w:t xml:space="preserve"> (</w:t>
+      </w:r>
+      <w:r>
+        <w:rPr>
+          <w:rFonts w:ascii="Consolas" w:cs="Consolas" w:eastAsia="Consolas" w:hAnsi="Consolas"/>
+          <w:color w:val="7B2C2C"/>
+          <w:sz w:val="19"/>
+          <w:szCs w:val="19"/>
+        </w:rPr>
+        <w:t xml:space="preserve">ems/web/</w:t>
+      </w:r>
+      <w:r>
+        <w:t xml:space="preserve">, Next.js 16.4 App Router, see </w:t>
+      </w:r>
+      <w:r>
+        <w:rPr>
+          <w:rFonts w:ascii="Consolas" w:cs="Consolas" w:eastAsia="Consolas" w:hAnsi="Consolas"/>
+          <w:color w:val="7B2C2C"/>
+          <w:sz w:val="19"/>
+          <w:szCs w:val="19"/>
+        </w:rPr>
+        <w:t xml:space="preserve">web/README.md</w:t>
+      </w:r>
+      <w:r>
+        <w:t xml:space="preserve">): about 35 screens against the real API. </w:t>
+      </w:r>
+      <w:r>
+        <w:rPr>
+          <w:rFonts w:ascii="Consolas" w:cs="Consolas" w:eastAsia="Consolas" w:hAnsi="Consolas"/>
+          <w:color w:val="7B2C2C"/>
+          <w:sz w:val="19"/>
+          <w:szCs w:val="19"/>
+        </w:rPr>
+        <w:t xml:space="preserve">/api/v1/*</w:t>
+      </w:r>
+      <w:r>
+        <w:t xml:space="preserve"> is rewritten to the API (</w:t>
+      </w:r>
+      <w:r>
+        <w:rPr>
+          <w:rFonts w:ascii="Consolas" w:cs="Consolas" w:eastAsia="Consolas" w:hAnsi="Consolas"/>
+          <w:color w:val="7B2C2C"/>
+          <w:sz w:val="19"/>
+          <w:szCs w:val="19"/>
+        </w:rPr>
+        <w:t xml:space="preserve">EMS_API_ORIGIN</w:t>
+      </w:r>
+      <w:r>
+        <w:t xml:space="preserve">), so cookies are first-party. </w:t>
+      </w:r>
+      <w:r>
+        <w:rPr>
+          <w:rFonts w:ascii="Consolas" w:cs="Consolas" w:eastAsia="Consolas" w:hAnsi="Consolas"/>
+          <w:color w:val="7B2C2C"/>
+          <w:sz w:val="19"/>
+          <w:szCs w:val="19"/>
+        </w:rPr>
+        <w:t xml:space="preserve">src/lib/api.ts</w:t>
+      </w:r>
+      <w:r>
+        <w:t xml:space="preserve"> handles the envelope, CSRF, idempotency keys and </w:t>
+      </w:r>
+      <w:r>
+        <w:rPr>
+          <w:rFonts w:ascii="Consolas" w:cs="Consolas" w:eastAsia="Consolas" w:hAnsi="Consolas"/>
+          <w:color w:val="7B2C2C"/>
+          <w:sz w:val="19"/>
+          <w:szCs w:val="19"/>
+        </w:rPr>
+        <w:t xml:space="preserve">X-Org-Id</w:t>
+      </w:r>
+      <w:r>
+        <w:t xml:space="preserve">; </w:t>
+      </w:r>
+      <w:r>
+        <w:rPr>
+          <w:rFonts w:ascii="Consolas" w:cs="Consolas" w:eastAsia="Consolas" w:hAnsi="Consolas"/>
+          <w:color w:val="7B2C2C"/>
+          <w:sz w:val="19"/>
+          <w:szCs w:val="19"/>
+        </w:rPr>
+        <w:t xml:space="preserve">src/lib/useApi.ts</w:t>
+      </w:r>
+      <w:r>
+        <w:t xml:space="preserve"> loads data (state set only in request callbacks, per React 19 lint); money stays a decimal string (</w:t>
+      </w:r>
+      <w:r>
+        <w:rPr>
+          <w:rFonts w:ascii="Consolas" w:cs="Consolas" w:eastAsia="Consolas" w:hAnsi="Consolas"/>
+          <w:color w:val="7B2C2C"/>
+          <w:sz w:val="19"/>
+          <w:szCs w:val="19"/>
+        </w:rPr>
+        <w:t xml:space="preserve">sumMoney</w:t>
+      </w:r>
+      <w:r>
+        <w:t xml:space="preserve"> uses integer cents). The SessionProvider guards the signed-in area from </w:t>
+      </w:r>
+      <w:r>
+        <w:rPr>
+          <w:rFonts w:ascii="Consolas" w:cs="Consolas" w:eastAsia="Consolas" w:hAnsi="Consolas"/>
+          <w:color w:val="7B2C2C"/>
+          <w:sz w:val="19"/>
+          <w:szCs w:val="19"/>
+        </w:rPr>
+        <w:t xml:space="preserve">/me</w:t>
+      </w:r>
+      <w:r>
+        <w:t xml:space="preserve">.</w:t>
+      </w:r>
+    </w:p>
+    <w:p>
+      <w:pPr>
+        <w:pStyle w:val="ListParagraph"/>
+        <w:numPr>
+          <w:ilvl w:val="0"/>
+          <w:numId w:val="2"/>
+        </w:numPr>
+        <w:spacing w:after="60"/>
+      </w:pPr>
+      <w:r>
+        <w:rPr>
+          <w:b/>
+          <w:bCs/>
+        </w:rPr>
+        <w:t xml:space="preserve">Extension</w:t>
+      </w:r>
+      <w:r>
+        <w:t xml:space="preserve"> (</w:t>
+      </w:r>
+      <w:r>
+        <w:rPr>
+          <w:rFonts w:ascii="Consolas" w:cs="Consolas" w:eastAsia="Consolas" w:hAnsi="Consolas"/>
+          <w:color w:val="7B2C2C"/>
+          <w:sz w:val="19"/>
+          <w:szCs w:val="19"/>
+        </w:rPr>
+        <w:t xml:space="preserve">ems/extension/</w:t>
+      </w:r>
+      <w:r>
+        <w:t xml:space="preserve">, Manifest V3, see </w:t>
+      </w:r>
+      <w:r>
+        <w:rPr>
+          <w:rFonts w:ascii="Consolas" w:cs="Consolas" w:eastAsia="Consolas" w:hAnsi="Consolas"/>
+          <w:color w:val="7B2C2C"/>
+          <w:sz w:val="19"/>
+          <w:szCs w:val="19"/>
+        </w:rPr>
+        <w:t xml:space="preserve">extension/README.md</w:t>
+      </w:r>
+      <w:r>
+        <w:t xml:space="preserve">): popup (sign-in, consent, check-in/out, breaks), service worker (30 s heartbeat alarm with </w:t>
+      </w:r>
+      <w:r>
+        <w:rPr>
+          <w:rFonts w:ascii="Consolas" w:cs="Consolas" w:eastAsia="Consolas" w:hAnsi="Consolas"/>
+          <w:color w:val="7B2C2C"/>
+          <w:sz w:val="19"/>
+          <w:szCs w:val="19"/>
+        </w:rPr>
+        <w:t xml:space="preserve">chrome.idle</w:t>
+      </w:r>
+      <w:r>
+        <w:t xml:space="preserve">), Media Session Page (LiveKit screen share), settings. Built with </w:t>
+      </w:r>
+      <w:r>
+        <w:rPr>
+          <w:rFonts w:ascii="Consolas" w:cs="Consolas" w:eastAsia="Consolas" w:hAnsi="Consolas"/>
+          <w:color w:val="7B2C2C"/>
+          <w:sz w:val="19"/>
+          <w:szCs w:val="19"/>
+        </w:rPr>
+        <w:t xml:space="preserve">tsc</w:t>
+      </w:r>
+      <w:r>
+        <w:t xml:space="preserve"> only; LiveKit's ES module is copied next to the media page. Pure rules live in </w:t>
+      </w:r>
+      <w:r>
+        <w:rPr>
+          <w:rFonts w:ascii="Consolas" w:cs="Consolas" w:eastAsia="Consolas" w:hAnsi="Consolas"/>
+          <w:color w:val="7B2C2C"/>
+          <w:sz w:val="19"/>
+          <w:szCs w:val="19"/>
+        </w:rPr>
+        <w:t xml:space="preserve">src/logic.ts</w:t>
+      </w:r>
+      <w:r>
+        <w:t xml:space="preserve"> and are unit-tested.</w:t>
+      </w:r>
+    </w:p>
+    <w:p>
+      <w:pPr>
+        <w:pStyle w:val="ListParagraph"/>
+        <w:numPr>
+          <w:ilvl w:val="0"/>
+          <w:numId w:val="2"/>
+        </w:numPr>
+        <w:spacing w:after="60"/>
+      </w:pPr>
+      <w:r>
+        <w:rPr>
+          <w:b/>
+          <w:bCs/>
+        </w:rPr>
+        <w:t xml:space="preserve">Backend additions for the screens</w:t>
+      </w:r>
+      <w:r>
+        <w:t xml:space="preserve">: read-only </w:t>
+      </w:r>
+      <w:r>
+        <w:rPr>
+          <w:rFonts w:ascii="Consolas" w:cs="Consolas" w:eastAsia="Consolas" w:hAnsi="Consolas"/>
+          <w:color w:val="7B2C2C"/>
+          <w:sz w:val="19"/>
+          <w:szCs w:val="19"/>
+        </w:rPr>
+        <w:t xml:space="preserve">GET /deals</w:t>
+      </w:r>
+      <w:r>
+        <w:t xml:space="preserve">, </w:t>
+      </w:r>
+      <w:r>
+        <w:rPr>
+          <w:rFonts w:ascii="Consolas" w:cs="Consolas" w:eastAsia="Consolas" w:hAnsi="Consolas"/>
+          <w:color w:val="7B2C2C"/>
+          <w:sz w:val="19"/>
+          <w:szCs w:val="19"/>
+        </w:rPr>
+        <w:t xml:space="preserve">/clients</w:t>
+      </w:r>
+      <w:r>
+        <w:t xml:space="preserve">, </w:t>
+      </w:r>
+      <w:r>
+        <w:rPr>
+          <w:rFonts w:ascii="Consolas" w:cs="Consolas" w:eastAsia="Consolas" w:hAnsi="Consolas"/>
+          <w:color w:val="7B2C2C"/>
+          <w:sz w:val="19"/>
+          <w:szCs w:val="19"/>
+        </w:rPr>
+        <w:t xml:space="preserve">/invoices</w:t>
+      </w:r>
+      <w:r>
+        <w:t xml:space="preserve">, </w:t>
+      </w:r>
+      <w:r>
+        <w:rPr>
+          <w:rFonts w:ascii="Consolas" w:cs="Consolas" w:eastAsia="Consolas" w:hAnsi="Consolas"/>
+          <w:color w:val="7B2C2C"/>
+          <w:sz w:val="19"/>
+          <w:szCs w:val="19"/>
+        </w:rPr>
+        <w:t xml:space="preserve">/hunts</w:t>
+      </w:r>
+      <w:r>
+        <w:t xml:space="preserve">, </w:t>
+      </w:r>
+      <w:r>
+        <w:rPr>
+          <w:rFonts w:ascii="Consolas" w:cs="Consolas" w:eastAsia="Consolas" w:hAnsi="Consolas"/>
+          <w:color w:val="7B2C2C"/>
+          <w:sz w:val="19"/>
+          <w:szCs w:val="19"/>
+        </w:rPr>
+        <w:t xml:space="preserve">/room/breaks</w:t>
+      </w:r>
+      <w:r>
+        <w:t xml:space="preserve">, </w:t>
+      </w:r>
+      <w:r>
+        <w:rPr>
+          <w:rFonts w:ascii="Consolas" w:cs="Consolas" w:eastAsia="Consolas" w:hAnsi="Consolas"/>
+          <w:color w:val="7B2C2C"/>
+          <w:sz w:val="19"/>
+          <w:szCs w:val="19"/>
+        </w:rPr>
+        <w:t xml:space="preserve">/org</w:t>
+      </w:r>
+      <w:r>
+        <w:t xml:space="preserve"> (outside the 70-operation contract; tested in </w:t>
+      </w:r>
+      <w:r>
+        <w:rPr>
+          <w:rFonts w:ascii="Consolas" w:cs="Consolas" w:eastAsia="Consolas" w:hAnsi="Consolas"/>
+          <w:color w:val="7B2C2C"/>
+          <w:sz w:val="19"/>
+          <w:szCs w:val="19"/>
+        </w:rPr>
+        <w:t xml:space="preserve">tests/test_web_lists.py</w:t>
+      </w:r>
+      <w:r>
+        <w:t xml:space="preserve">), and </w:t>
+      </w:r>
+      <w:r>
+        <w:rPr>
+          <w:rFonts w:ascii="Consolas" w:cs="Consolas" w:eastAsia="Consolas" w:hAnsi="Consolas"/>
+          <w:color w:val="7B2C2C"/>
+          <w:sz w:val="19"/>
+          <w:szCs w:val="19"/>
+        </w:rPr>
+        <w:t xml:space="preserve">POST /room/stream/view-grid</w:t>
+      </w:r>
+      <w:r>
+        <w:t xml:space="preserve"> (tested in </w:t>
+      </w:r>
+      <w:r>
+        <w:rPr>
+          <w:rFonts w:ascii="Consolas" w:cs="Consolas" w:eastAsia="Consolas" w:hAnsi="Consolas"/>
+          <w:color w:val="7B2C2C"/>
+          <w:sz w:val="19"/>
+          <w:szCs w:val="19"/>
+        </w:rPr>
+        <w:t xml:space="preserve">tests/test_webcam.py</w:t>
+      </w:r>
+      <w:r>
+        <w:t xml:space="preserve">). Web pages for them include </w:t>
+      </w:r>
+      <w:r>
+        <w:rPr>
+          <w:rFonts w:ascii="Consolas" w:cs="Consolas" w:eastAsia="Consolas" w:hAnsi="Consolas"/>
+          <w:color w:val="7B2C2C"/>
+          <w:sz w:val="19"/>
+          <w:szCs w:val="19"/>
+        </w:rPr>
+        <w:t xml:space="preserve">/crm/clients</w:t>
+      </w:r>
+      <w:r>
+        <w:t xml:space="preserve">, </w:t>
+      </w:r>
+      <w:r>
+        <w:rPr>
+          <w:rFonts w:ascii="Consolas" w:cs="Consolas" w:eastAsia="Consolas" w:hAnsi="Consolas"/>
+          <w:color w:val="7B2C2C"/>
+          <w:sz w:val="19"/>
+          <w:szCs w:val="19"/>
+        </w:rPr>
+        <w:t xml:space="preserve">/crm/deals</w:t>
+      </w:r>
+      <w:r>
+        <w:t xml:space="preserve">, </w:t>
+      </w:r>
+      <w:r>
+        <w:rPr>
+          <w:rFonts w:ascii="Consolas" w:cs="Consolas" w:eastAsia="Consolas" w:hAnsi="Consolas"/>
+          <w:color w:val="7B2C2C"/>
+          <w:sz w:val="19"/>
+          <w:szCs w:val="19"/>
+        </w:rPr>
+        <w:t xml:space="preserve">/room/wall</w:t>
+      </w:r>
+      <w:r>
+        <w:t xml:space="preserve"> (CEO video wall) and check-in/check-out on </w:t>
+      </w:r>
+      <w:r>
+        <w:rPr>
+          <w:rFonts w:ascii="Consolas" w:cs="Consolas" w:eastAsia="Consolas" w:hAnsi="Consolas"/>
+          <w:color w:val="7B2C2C"/>
+          <w:sz w:val="19"/>
+          <w:szCs w:val="19"/>
+        </w:rPr>
+        <w:t xml:space="preserve">/room/me</w:t>
+      </w:r>
+      <w:r>
+        <w:t xml:space="preserve">.</w:t>
+      </w:r>
+    </w:p>
+    <w:p>
+      <w:pPr>
+        <w:pStyle w:val="Heading1"/>
+      </w:pPr>
+      <w:r>
+        <w:t xml:space="preserve">9. Out of scope</w:t>
       </w:r>
     </w:p>
     <w:p>

</xml_diff>